<commit_message>
[feat] captura e salva guarda composição geral patrimonial e resultado
</commit_message>
<xml_diff>
--- a/documentacao/Documento Funcional - Captura Docs Composição Geral para Mapa Patrimonial.docx
+++ b/documentacao/Documento Funcional - Captura Docs Composição Geral para Mapa Patrimonial.docx
@@ -139,11 +139,10 @@
     </w:p>
     <w:p>
       <w:pPr>
-        <w:pStyle w:val="Ttulo1"/>
+        <w:pStyle w:val="Heading1"/>
       </w:pPr>
       <w:bookmarkStart w:id="0" w:name="_Toc238214540"/>
       <w:r>
-        <w:lastRenderedPageBreak/>
         <w:t>Sumário</w:t>
       </w:r>
       <w:bookmarkEnd w:id="0"/>
@@ -153,11 +152,10 @@
         <w:alias w:val="Sumário"/>
         <w:id w:val="1665819881"/>
       </w:sdtPr>
-      <w:sdtEndPr/>
       <w:sdtContent>
         <w:p>
           <w:pPr>
-            <w:pStyle w:val="Sumrio1"/>
+            <w:pStyle w:val="TOC1"/>
             <w:tabs>
               <w:tab w:val="right" w:leader="dot" w:pos="8494"/>
             </w:tabs>
@@ -232,7 +230,7 @@
         </w:p>
         <w:p>
           <w:pPr>
-            <w:pStyle w:val="Sumrio1"/>
+            <w:pStyle w:val="TOC1"/>
             <w:tabs>
               <w:tab w:val="right" w:leader="dot" w:pos="8494"/>
             </w:tabs>
@@ -298,7 +296,7 @@
         </w:p>
         <w:p>
           <w:pPr>
-            <w:pStyle w:val="Sumrio1"/>
+            <w:pStyle w:val="TOC1"/>
             <w:tabs>
               <w:tab w:val="right" w:leader="dot" w:pos="8494"/>
             </w:tabs>
@@ -364,7 +362,7 @@
         </w:p>
         <w:p>
           <w:pPr>
-            <w:pStyle w:val="Sumrio1"/>
+            <w:pStyle w:val="TOC1"/>
             <w:tabs>
               <w:tab w:val="right" w:leader="dot" w:pos="8494"/>
             </w:tabs>
@@ -430,7 +428,7 @@
         </w:p>
         <w:p>
           <w:pPr>
-            <w:pStyle w:val="Sumrio1"/>
+            <w:pStyle w:val="TOC1"/>
             <w:tabs>
               <w:tab w:val="right" w:leader="dot" w:pos="8494"/>
             </w:tabs>
@@ -496,7 +494,7 @@
         </w:p>
         <w:p>
           <w:pPr>
-            <w:pStyle w:val="Sumrio1"/>
+            <w:pStyle w:val="TOC1"/>
             <w:tabs>
               <w:tab w:val="right" w:leader="dot" w:pos="8494"/>
             </w:tabs>
@@ -562,7 +560,7 @@
         </w:p>
         <w:p>
           <w:pPr>
-            <w:pStyle w:val="Sumrio1"/>
+            <w:pStyle w:val="TOC1"/>
             <w:tabs>
               <w:tab w:val="right" w:leader="dot" w:pos="8494"/>
             </w:tabs>
@@ -628,7 +626,7 @@
         </w:p>
         <w:p>
           <w:pPr>
-            <w:pStyle w:val="Sumrio1"/>
+            <w:pStyle w:val="TOC1"/>
             <w:tabs>
               <w:tab w:val="right" w:leader="dot" w:pos="8494"/>
             </w:tabs>
@@ -694,7 +692,7 @@
         </w:p>
         <w:p>
           <w:pPr>
-            <w:pStyle w:val="Sumrio1"/>
+            <w:pStyle w:val="TOC1"/>
             <w:tabs>
               <w:tab w:val="right" w:leader="dot" w:pos="8494"/>
             </w:tabs>
@@ -772,11 +770,10 @@
     </w:p>
     <w:p>
       <w:pPr>
-        <w:pStyle w:val="Ttulo1"/>
+        <w:pStyle w:val="Heading1"/>
       </w:pPr>
       <w:bookmarkStart w:id="1" w:name="_Toc238214541"/>
       <w:r>
-        <w:lastRenderedPageBreak/>
         <w:t>Controle de Versão</w:t>
       </w:r>
       <w:bookmarkEnd w:id="1"/>
@@ -1070,7 +1067,7 @@
     </w:tbl>
     <w:p>
       <w:pPr>
-        <w:pStyle w:val="Ttulo1"/>
+        <w:pStyle w:val="Heading1"/>
       </w:pPr>
       <w:bookmarkStart w:id="2" w:name="_Toc238214542"/>
       <w:r>
@@ -1152,7 +1149,7 @@
     </w:p>
     <w:p>
       <w:pPr>
-        <w:pStyle w:val="Ttulo1"/>
+        <w:pStyle w:val="Heading1"/>
       </w:pPr>
       <w:bookmarkStart w:id="3" w:name="_Toc238214543"/>
       <w:r>
@@ -1772,7 +1769,7 @@
     </w:tbl>
     <w:p>
       <w:pPr>
-        <w:pStyle w:val="Ttulo1"/>
+        <w:pStyle w:val="Heading1"/>
       </w:pPr>
       <w:bookmarkStart w:id="4" w:name="_Toc238214544"/>
       <w:r>
@@ -1828,12 +1825,12 @@
     </w:p>
     <w:p>
       <w:pPr>
-        <w:pStyle w:val="Ttulo1"/>
+        <w:pStyle w:val="Heading1"/>
       </w:pPr>
     </w:p>
     <w:p>
       <w:pPr>
-        <w:pStyle w:val="Ttulo1"/>
+        <w:pStyle w:val="Heading1"/>
       </w:pPr>
       <w:bookmarkStart w:id="5" w:name="_Toc238214545"/>
       <w:r>
@@ -2422,7 +2419,7 @@
     </w:tbl>
     <w:p>
       <w:pPr>
-        <w:pStyle w:val="Ttulo1"/>
+        <w:pStyle w:val="Heading1"/>
       </w:pPr>
       <w:bookmarkStart w:id="6" w:name="_Toc238214546"/>
       <w:r>
@@ -2901,7 +2898,7 @@
     </w:tbl>
     <w:p>
       <w:pPr>
-        <w:pStyle w:val="Ttulo1"/>
+        <w:pStyle w:val="Heading1"/>
       </w:pPr>
       <w:bookmarkStart w:id="7" w:name="_Toc238214547"/>
       <w:r>
@@ -2911,7 +2908,7 @@
     </w:p>
     <w:p>
       <w:pPr>
-        <w:pStyle w:val="PargrafodaLista"/>
+        <w:pStyle w:val="ListParagraph"/>
         <w:numPr>
           <w:ilvl w:val="0"/>
           <w:numId w:val="2"/>
@@ -2924,7 +2921,7 @@
     </w:p>
     <w:p>
       <w:pPr>
-        <w:pStyle w:val="PargrafodaLista"/>
+        <w:pStyle w:val="ListParagraph"/>
         <w:numPr>
           <w:ilvl w:val="0"/>
           <w:numId w:val="2"/>
@@ -2949,7 +2946,7 @@
     </w:p>
     <w:p>
       <w:pPr>
-        <w:pStyle w:val="PargrafodaLista"/>
+        <w:pStyle w:val="ListParagraph"/>
         <w:numPr>
           <w:ilvl w:val="0"/>
           <w:numId w:val="2"/>
@@ -2962,7 +2959,7 @@
     </w:p>
     <w:p>
       <w:pPr>
-        <w:pStyle w:val="PargrafodaLista"/>
+        <w:pStyle w:val="ListParagraph"/>
         <w:numPr>
           <w:ilvl w:val="0"/>
           <w:numId w:val="2"/>
@@ -2975,7 +2972,7 @@
     </w:p>
     <w:p>
       <w:pPr>
-        <w:pStyle w:val="PargrafodaLista"/>
+        <w:pStyle w:val="ListParagraph"/>
         <w:numPr>
           <w:ilvl w:val="0"/>
           <w:numId w:val="2"/>
@@ -2988,7 +2985,7 @@
     </w:p>
     <w:p>
       <w:pPr>
-        <w:pStyle w:val="PargrafodaLista"/>
+        <w:pStyle w:val="ListParagraph"/>
         <w:numPr>
           <w:ilvl w:val="0"/>
           <w:numId w:val="2"/>
@@ -3007,7 +3004,7 @@
     </w:p>
     <w:p>
       <w:pPr>
-        <w:pStyle w:val="PargrafodaLista"/>
+        <w:pStyle w:val="ListParagraph"/>
         <w:numPr>
           <w:ilvl w:val="0"/>
           <w:numId w:val="2"/>
@@ -3020,7 +3017,7 @@
     </w:p>
     <w:p>
       <w:pPr>
-        <w:pStyle w:val="PargrafodaLista"/>
+        <w:pStyle w:val="ListParagraph"/>
         <w:numPr>
           <w:ilvl w:val="0"/>
           <w:numId w:val="2"/>
@@ -3039,7 +3036,7 @@
     </w:p>
     <w:p>
       <w:pPr>
-        <w:pStyle w:val="PargrafodaLista"/>
+        <w:pStyle w:val="ListParagraph"/>
         <w:numPr>
           <w:ilvl w:val="0"/>
           <w:numId w:val="2"/>
@@ -3052,7 +3049,7 @@
     </w:p>
     <w:p>
       <w:pPr>
-        <w:pStyle w:val="PargrafodaLista"/>
+        <w:pStyle w:val="ListParagraph"/>
         <w:numPr>
           <w:ilvl w:val="0"/>
           <w:numId w:val="2"/>
@@ -3060,13 +3057,12 @@
         <w:spacing w:after="60"/>
       </w:pPr>
       <w:r>
-        <w:lastRenderedPageBreak/>
         <w:t>Quando nova empresa parceira for adicionada aos cruzamentos, será, será a execução para o robô da nova empresa.</w:t>
       </w:r>
     </w:p>
     <w:p>
       <w:pPr>
-        <w:pStyle w:val="PargrafodaLista"/>
+        <w:pStyle w:val="ListParagraph"/>
         <w:numPr>
           <w:ilvl w:val="0"/>
           <w:numId w:val="2"/>
@@ -3082,7 +3078,7 @@
     </w:p>
     <w:p>
       <w:pPr>
-        <w:pStyle w:val="Ttulo1"/>
+        <w:pStyle w:val="Heading1"/>
       </w:pPr>
       <w:bookmarkStart w:id="8" w:name="_Toc238214548"/>
       <w:r>
@@ -3092,7 +3088,7 @@
     </w:p>
     <w:p>
       <w:pPr>
-        <w:pStyle w:val="Ttulo2"/>
+        <w:pStyle w:val="Heading2"/>
       </w:pPr>
       <w:r>
         <w:t>Anexo A — Exemplos de E-mail e Anexos Recebidos da Accenture</w:t>
@@ -3577,13 +3573,12 @@
           <w:b/>
           <w:bCs/>
         </w:rPr>
-        <w:lastRenderedPageBreak/>
         <w:t>Pontos de atenção já mapeados para este passo:</w:t>
       </w:r>
     </w:p>
     <w:p>
       <w:pPr>
-        <w:pStyle w:val="PargrafodaLista"/>
+        <w:pStyle w:val="ListParagraph"/>
         <w:numPr>
           <w:ilvl w:val="0"/>
           <w:numId w:val="3"/>
@@ -3599,7 +3594,7 @@
     </w:p>
     <w:p>
       <w:pPr>
-        <w:pStyle w:val="PargrafodaLista"/>
+        <w:pStyle w:val="ListParagraph"/>
         <w:numPr>
           <w:ilvl w:val="0"/>
           <w:numId w:val="3"/>
@@ -3624,7 +3619,7 @@
     </w:p>
     <w:p>
       <w:pPr>
-        <w:pStyle w:val="PargrafodaLista"/>
+        <w:pStyle w:val="ListParagraph"/>
         <w:numPr>
           <w:ilvl w:val="0"/>
           <w:numId w:val="3"/>
@@ -3640,7 +3635,7 @@
     </w:p>
     <w:p>
       <w:pPr>
-        <w:pStyle w:val="PargrafodaLista"/>
+        <w:pStyle w:val="ListParagraph"/>
         <w:numPr>
           <w:ilvl w:val="0"/>
           <w:numId w:val="3"/>
@@ -3668,7 +3663,7 @@
     </w:p>
     <w:p>
       <w:pPr>
-        <w:pStyle w:val="Ttulo2"/>
+        <w:pStyle w:val="Heading2"/>
       </w:pPr>
       <w:r>
         <w:t>Anexo B — Caminhos de Rede Utilizados</w:t>
@@ -4320,7 +4315,7 @@
     <w:p/>
     <w:p>
       <w:pPr>
-        <w:pStyle w:val="Ttulo2"/>
+        <w:pStyle w:val="Heading2"/>
       </w:pPr>
       <w:r>
         <w:t>Anexo C — Cronograma</w:t>
@@ -5134,7 +5129,7 @@
 <w:ftr xmlns:wpc="http://schemas.microsoft.com/office/word/2010/wordprocessingCanvas" xmlns:cx="http://schemas.microsoft.com/office/drawing/2014/chartex" xmlns:cx1="http://schemas.microsoft.com/office/drawing/2015/9/8/chartex" xmlns:cx2="http://schemas.microsoft.com/office/drawing/2015/10/21/chartex" xmlns:cx3="http://schemas.microsoft.com/office/drawing/2016/5/9/chartex" xmlns:cx4="http://schemas.microsoft.com/office/drawing/2016/5/10/chartex" xmlns:cx5="http://schemas.microsoft.com/office/drawing/2016/5/11/chartex" xmlns:cx6="http://schemas.microsoft.com/office/drawing/2016/5/12/chartex" xmlns:cx7="http://schemas.microsoft.com/office/drawing/2016/5/13/chartex" xmlns:cx8="http://schemas.microsoft.com/office/drawing/2016/5/14/chartex" xmlns:mc="http://schemas.openxmlformats.org/markup-compatibility/2006" xmlns:aink="http://schemas.microsoft.com/office/drawing/2016/ink" xmlns:am3d="http://schemas.microsoft.com/office/drawing/2017/model3d" xmlns:o="urn:schemas-microsoft-com:office:office" xmlns:oel="http://schemas.microsoft.com/office/2019/extlst" xmlns:r="http://schemas.openxmlformats.org/officeDocument/2006/relationships" xmlns:m="http://schemas.openxmlformats.org/officeDocument/2006/math" xmlns:v="urn:schemas-microsoft-com:vml" xmlns:wp14="http://schemas.microsoft.com/office/word/2010/wordprocessingDrawing" xmlns:wp="http://schemas.openxmlformats.org/drawingml/2006/wordprocessingDrawing" xmlns:w10="urn:schemas-microsoft-com:office:word" xmlns:w="http://schemas.openxmlformats.org/wordprocessingml/2006/main" xmlns:w14="http://schemas.microsoft.com/office/word/2010/wordml" xmlns:w15="http://schemas.microsoft.com/office/word/2012/wordml" xmlns:w16cex="http://schemas.microsoft.com/office/word/2018/wordml/cex" xmlns:w16cid="http://schemas.microsoft.com/office/word/2016/wordml/cid" xmlns:w16="http://schemas.microsoft.com/office/word/2018/wordml" xmlns:w16du="http://schemas.microsoft.com/office/word/2023/wordml/word16du" xmlns:w16sdtdh="http://schemas.microsoft.com/office/word/2020/wordml/sdtdatahash" xmlns:w16sdtfl="http://schemas.microsoft.com/office/word/2024/wordml/sdtformatlock" xmlns:w16se="http://schemas.microsoft.com/office/word/2015/wordml/symex" xmlns:wpg="http://schemas.microsoft.com/office/word/2010/wordprocessingGroup" xmlns:wpi="http://schemas.microsoft.com/office/word/2010/wordprocessingInk" xmlns:wne="http://schemas.microsoft.com/office/word/2006/wordml" xmlns:wps="http://schemas.microsoft.com/office/word/2010/wordprocessingShape" mc:Ignorable="w14 w15 w16se w16cid w16 w16cex w16sdtdh w16sdtfl w16du wp14">
   <w:p>
     <w:pPr>
-      <w:pStyle w:val="Rodap"/>
+      <w:pStyle w:val="Footer"/>
     </w:pPr>
     <w:r>
       <w:rPr>
@@ -5143,7 +5138,7 @@
       <mc:AlternateContent>
         <mc:Choice Requires="wps">
           <w:drawing>
-            <wp:anchor distT="0" distB="0" distL="0" distR="0" simplePos="0" relativeHeight="251662336" behindDoc="0" locked="0" layoutInCell="1" allowOverlap="1" wp14:anchorId="18A57A42" wp14:editId="38FFB8C7">
+            <wp:anchor distT="0" distB="0" distL="0" distR="0" simplePos="0" relativeHeight="251658244" behindDoc="0" locked="0" layoutInCell="1" allowOverlap="1" wp14:anchorId="18A57A42" wp14:editId="38FFB8C7">
               <wp:simplePos x="635" y="635"/>
               <wp:positionH relativeFrom="page">
                 <wp:align>left</wp:align>
@@ -5243,7 +5238,7 @@
               <v:stroke joinstyle="miter"/>
               <v:path gradientshapeok="t" o:connecttype="rect"/>
             </v:shapetype>
-            <v:shape id="_x0000_s1028" type="#_x0000_t202" alt="*** Clasificado CORPORATIVO por TELEFÓNICA. *** Classified CORPORATE by TELEFÓNICA.&#10;*** Classificado como CORPORATIVO pela TELEFÓNICA. *** Von TELEFÓNICA als UNTERNEHMENSINTERN eingestuft." style="position:absolute;margin-left:0;margin-top:0;width:327.9pt;height:29.65pt;z-index:251662336;visibility:visible;mso-wrap-style:none;mso-wrap-distance-left:0;mso-wrap-distance-top:0;mso-wrap-distance-right:0;mso-wrap-distance-bottom:0;mso-position-horizontal:left;mso-position-horizontal-relative:page;mso-position-vertical:bottom;mso-position-vertical-relative:page;v-text-anchor:bottom" o:gfxdata="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" filled="f" stroked="f">
+            <v:shape id="_x0000_s1028" type="#_x0000_t202" alt="*** Clasificado CORPORATIVO por TELEFÓNICA. *** Classified CORPORATE by TELEFÓNICA.&#10;*** Classificado como CORPORATIVO pela TELEFÓNICA. *** Von TELEFÓNICA als UNTERNEHMENSINTERN eingestuft." style="position:absolute;margin-left:0;margin-top:0;width:327.9pt;height:29.65pt;z-index:251658244;visibility:visible;mso-wrap-style:none;mso-wrap-distance-left:0;mso-wrap-distance-top:0;mso-wrap-distance-right:0;mso-wrap-distance-bottom:0;mso-position-horizontal:left;mso-position-horizontal-relative:page;mso-position-vertical:bottom;mso-position-vertical-relative:page;v-text-anchor:bottom" o:gfxdata="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" filled="f" stroked="f">
               <v:textbox style="mso-fit-shape-to-text:t" inset="20pt,0,0,15pt">
                 <w:txbxContent>
                   <w:p>
@@ -5310,7 +5305,7 @@
       <mc:AlternateContent>
         <mc:Choice Requires="wps">
           <w:drawing>
-            <wp:anchor distT="0" distB="0" distL="0" distR="0" simplePos="0" relativeHeight="251663360" behindDoc="0" locked="0" layoutInCell="1" allowOverlap="1" wp14:anchorId="5722F5D3" wp14:editId="65FB0CA3">
+            <wp:anchor distT="0" distB="0" distL="0" distR="0" simplePos="0" relativeHeight="251658245" behindDoc="0" locked="0" layoutInCell="1" allowOverlap="1" wp14:anchorId="5722F5D3" wp14:editId="65FB0CA3">
               <wp:simplePos x="1078252" y="10026687"/>
               <wp:positionH relativeFrom="page">
                 <wp:align>left</wp:align>
@@ -5410,7 +5405,7 @@
               <v:stroke joinstyle="miter"/>
               <v:path gradientshapeok="t" o:connecttype="rect"/>
             </v:shapetype>
-            <v:shape id="_x0000_s1029" type="#_x0000_t202" alt="*** Clasificado CORPORATIVO por TELEFÓNICA. *** Classified CORPORATE by TELEFÓNICA.&#10;*** Classificado como CORPORATIVO pela TELEFÓNICA. *** Von TELEFÓNICA als UNTERNEHMENSINTERN eingestuft." style="position:absolute;margin-left:0;margin-top:0;width:327.9pt;height:29.65pt;z-index:251663360;visibility:visible;mso-wrap-style:none;mso-wrap-distance-left:0;mso-wrap-distance-top:0;mso-wrap-distance-right:0;mso-wrap-distance-bottom:0;mso-position-horizontal:left;mso-position-horizontal-relative:page;mso-position-vertical:bottom;mso-position-vertical-relative:page;v-text-anchor:bottom" o:gfxdata="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" filled="f" stroked="f">
+            <v:shape id="_x0000_s1029" type="#_x0000_t202" alt="*** Clasificado CORPORATIVO por TELEFÓNICA. *** Classified CORPORATE by TELEFÓNICA.&#10;*** Classificado como CORPORATIVO pela TELEFÓNICA. *** Von TELEFÓNICA als UNTERNEHMENSINTERN eingestuft." style="position:absolute;margin-left:0;margin-top:0;width:327.9pt;height:29.65pt;z-index:251658245;visibility:visible;mso-wrap-style:none;mso-wrap-distance-left:0;mso-wrap-distance-top:0;mso-wrap-distance-right:0;mso-wrap-distance-bottom:0;mso-position-horizontal:left;mso-position-horizontal-relative:page;mso-position-vertical:bottom;mso-position-vertical-relative:page;v-text-anchor:bottom" o:gfxdata="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" filled="f" stroked="f">
               <v:textbox style="mso-fit-shape-to-text:t" inset="20pt,0,0,15pt">
                 <w:txbxContent>
                   <w:p>
@@ -5514,7 +5509,7 @@
 <w:ftr xmlns:wpc="http://schemas.microsoft.com/office/word/2010/wordprocessingCanvas" xmlns:cx="http://schemas.microsoft.com/office/drawing/2014/chartex" xmlns:cx1="http://schemas.microsoft.com/office/drawing/2015/9/8/chartex" xmlns:cx2="http://schemas.microsoft.com/office/drawing/2015/10/21/chartex" xmlns:cx3="http://schemas.microsoft.com/office/drawing/2016/5/9/chartex" xmlns:cx4="http://schemas.microsoft.com/office/drawing/2016/5/10/chartex" xmlns:cx5="http://schemas.microsoft.com/office/drawing/2016/5/11/chartex" xmlns:cx6="http://schemas.microsoft.com/office/drawing/2016/5/12/chartex" xmlns:cx7="http://schemas.microsoft.com/office/drawing/2016/5/13/chartex" xmlns:cx8="http://schemas.microsoft.com/office/drawing/2016/5/14/chartex" xmlns:mc="http://schemas.openxmlformats.org/markup-compatibility/2006" xmlns:aink="http://schemas.microsoft.com/office/drawing/2016/ink" xmlns:am3d="http://schemas.microsoft.com/office/drawing/2017/model3d" xmlns:o="urn:schemas-microsoft-com:office:office" xmlns:oel="http://schemas.microsoft.com/office/2019/extlst" xmlns:r="http://schemas.openxmlformats.org/officeDocument/2006/relationships" xmlns:m="http://schemas.openxmlformats.org/officeDocument/2006/math" xmlns:v="urn:schemas-microsoft-com:vml" xmlns:wp14="http://schemas.microsoft.com/office/word/2010/wordprocessingDrawing" xmlns:wp="http://schemas.openxmlformats.org/drawingml/2006/wordprocessingDrawing" xmlns:w10="urn:schemas-microsoft-com:office:word" xmlns:w="http://schemas.openxmlformats.org/wordprocessingml/2006/main" xmlns:w14="http://schemas.microsoft.com/office/word/2010/wordml" xmlns:w15="http://schemas.microsoft.com/office/word/2012/wordml" xmlns:w16cex="http://schemas.microsoft.com/office/word/2018/wordml/cex" xmlns:w16cid="http://schemas.microsoft.com/office/word/2016/wordml/cid" xmlns:w16="http://schemas.microsoft.com/office/word/2018/wordml" xmlns:w16du="http://schemas.microsoft.com/office/word/2023/wordml/word16du" xmlns:w16sdtdh="http://schemas.microsoft.com/office/word/2020/wordml/sdtdatahash" xmlns:w16sdtfl="http://schemas.microsoft.com/office/word/2024/wordml/sdtformatlock" xmlns:w16se="http://schemas.microsoft.com/office/word/2015/wordml/symex" xmlns:wpg="http://schemas.microsoft.com/office/word/2010/wordprocessingGroup" xmlns:wpi="http://schemas.microsoft.com/office/word/2010/wordprocessingInk" xmlns:wne="http://schemas.microsoft.com/office/word/2006/wordml" xmlns:wps="http://schemas.microsoft.com/office/word/2010/wordprocessingShape" mc:Ignorable="w14 w15 w16se w16cid w16 w16cex w16sdtdh w16sdtfl w16du wp14">
   <w:p>
     <w:pPr>
-      <w:pStyle w:val="Rodap"/>
+      <w:pStyle w:val="Footer"/>
     </w:pPr>
     <w:r>
       <w:rPr>
@@ -5523,7 +5518,7 @@
       <mc:AlternateContent>
         <mc:Choice Requires="wps">
           <w:drawing>
-            <wp:anchor distT="0" distB="0" distL="0" distR="0" simplePos="0" relativeHeight="251661312" behindDoc="0" locked="0" layoutInCell="1" allowOverlap="1" wp14:anchorId="3B373269" wp14:editId="2A036BF9">
+            <wp:anchor distT="0" distB="0" distL="0" distR="0" simplePos="0" relativeHeight="251658243" behindDoc="0" locked="0" layoutInCell="1" allowOverlap="1" wp14:anchorId="3B373269" wp14:editId="2A036BF9">
               <wp:simplePos x="635" y="635"/>
               <wp:positionH relativeFrom="page">
                 <wp:align>left</wp:align>
@@ -5623,7 +5618,7 @@
               <v:stroke joinstyle="miter"/>
               <v:path gradientshapeok="t" o:connecttype="rect"/>
             </v:shapetype>
-            <v:shape id="_x0000_s1031" type="#_x0000_t202" alt="*** Clasificado CORPORATIVO por TELEFÓNICA. *** Classified CORPORATE by TELEFÓNICA.&#10;*** Classificado como CORPORATIVO pela TELEFÓNICA. *** Von TELEFÓNICA als UNTERNEHMENSINTERN eingestuft." style="position:absolute;margin-left:0;margin-top:0;width:327.9pt;height:29.65pt;z-index:251661312;visibility:visible;mso-wrap-style:none;mso-wrap-distance-left:0;mso-wrap-distance-top:0;mso-wrap-distance-right:0;mso-wrap-distance-bottom:0;mso-position-horizontal:left;mso-position-horizontal-relative:page;mso-position-vertical:bottom;mso-position-vertical-relative:page;v-text-anchor:bottom" o:gfxdata="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" filled="f" stroked="f">
+            <v:shape id="_x0000_s1031" type="#_x0000_t202" alt="*** Clasificado CORPORATIVO por TELEFÓNICA. *** Classified CORPORATE by TELEFÓNICA.&#10;*** Classificado como CORPORATIVO pela TELEFÓNICA. *** Von TELEFÓNICA als UNTERNEHMENSINTERN eingestuft." style="position:absolute;margin-left:0;margin-top:0;width:327.9pt;height:29.65pt;z-index:251658243;visibility:visible;mso-wrap-style:none;mso-wrap-distance-left:0;mso-wrap-distance-top:0;mso-wrap-distance-right:0;mso-wrap-distance-bottom:0;mso-position-horizontal:left;mso-position-horizontal-relative:page;mso-position-vertical:bottom;mso-position-vertical-relative:page;v-text-anchor:bottom" o:gfxdata="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" filled="f" stroked="f">
               <v:textbox style="mso-fit-shape-to-text:t" inset="20pt,0,0,15pt">
                 <w:txbxContent>
                   <w:p>
@@ -5703,7 +5698,7 @@
 <w:hdr xmlns:wpc="http://schemas.microsoft.com/office/word/2010/wordprocessingCanvas" xmlns:cx="http://schemas.microsoft.com/office/drawing/2014/chartex" xmlns:cx1="http://schemas.microsoft.com/office/drawing/2015/9/8/chartex" xmlns:cx2="http://schemas.microsoft.com/office/drawing/2015/10/21/chartex" xmlns:cx3="http://schemas.microsoft.com/office/drawing/2016/5/9/chartex" xmlns:cx4="http://schemas.microsoft.com/office/drawing/2016/5/10/chartex" xmlns:cx5="http://schemas.microsoft.com/office/drawing/2016/5/11/chartex" xmlns:cx6="http://schemas.microsoft.com/office/drawing/2016/5/12/chartex" xmlns:cx7="http://schemas.microsoft.com/office/drawing/2016/5/13/chartex" xmlns:cx8="http://schemas.microsoft.com/office/drawing/2016/5/14/chartex" xmlns:mc="http://schemas.openxmlformats.org/markup-compatibility/2006" xmlns:aink="http://schemas.microsoft.com/office/drawing/2016/ink" xmlns:am3d="http://schemas.microsoft.com/office/drawing/2017/model3d" xmlns:o="urn:schemas-microsoft-com:office:office" xmlns:oel="http://schemas.microsoft.com/office/2019/extlst" xmlns:r="http://schemas.openxmlformats.org/officeDocument/2006/relationships" xmlns:m="http://schemas.openxmlformats.org/officeDocument/2006/math" xmlns:v="urn:schemas-microsoft-com:vml" xmlns:wp14="http://schemas.microsoft.com/office/word/2010/wordprocessingDrawing" xmlns:wp="http://schemas.openxmlformats.org/drawingml/2006/wordprocessingDrawing" xmlns:w10="urn:schemas-microsoft-com:office:word" xmlns:w="http://schemas.openxmlformats.org/wordprocessingml/2006/main" xmlns:w14="http://schemas.microsoft.com/office/word/2010/wordml" xmlns:w15="http://schemas.microsoft.com/office/word/2012/wordml" xmlns:w16cex="http://schemas.microsoft.com/office/word/2018/wordml/cex" xmlns:w16cid="http://schemas.microsoft.com/office/word/2016/wordml/cid" xmlns:w16="http://schemas.microsoft.com/office/word/2018/wordml" xmlns:w16du="http://schemas.microsoft.com/office/word/2023/wordml/word16du" xmlns:w16sdtdh="http://schemas.microsoft.com/office/word/2020/wordml/sdtdatahash" xmlns:w16sdtfl="http://schemas.microsoft.com/office/word/2024/wordml/sdtformatlock" xmlns:w16se="http://schemas.microsoft.com/office/word/2015/wordml/symex" xmlns:wpg="http://schemas.microsoft.com/office/word/2010/wordprocessingGroup" xmlns:wpi="http://schemas.microsoft.com/office/word/2010/wordprocessingInk" xmlns:wne="http://schemas.microsoft.com/office/word/2006/wordml" xmlns:wps="http://schemas.microsoft.com/office/word/2010/wordprocessingShape" mc:Ignorable="w14 w15 w16se w16cid w16 w16cex w16sdtdh w16sdtfl w16du wp14">
   <w:p>
     <w:pPr>
-      <w:pStyle w:val="Cabealho"/>
+      <w:pStyle w:val="Header"/>
     </w:pPr>
     <w:r>
       <w:rPr>
@@ -5712,7 +5707,7 @@
       <mc:AlternateContent>
         <mc:Choice Requires="wps">
           <w:drawing>
-            <wp:anchor distT="0" distB="0" distL="0" distR="0" simplePos="0" relativeHeight="251659264" behindDoc="0" locked="0" layoutInCell="1" allowOverlap="1" wp14:anchorId="7B8332FC" wp14:editId="11E30E26">
+            <wp:anchor distT="0" distB="0" distL="0" distR="0" simplePos="0" relativeHeight="251658241" behindDoc="0" locked="0" layoutInCell="1" allowOverlap="1" wp14:anchorId="7B8332FC" wp14:editId="11E30E26">
               <wp:simplePos x="635" y="635"/>
               <wp:positionH relativeFrom="page">
                 <wp:align>right</wp:align>
@@ -5791,7 +5786,7 @@
               <v:stroke joinstyle="miter"/>
               <v:path gradientshapeok="t" o:connecttype="rect"/>
             </v:shapetype>
-            <v:shape id="Caixa de Texto 2" o:spid="_x0000_s1026" type="#_x0000_t202" alt="Uso Interno" style="position:absolute;margin-left:19.05pt;margin-top:0;width:70.25pt;height:27.2pt;z-index:251659264;visibility:visible;mso-wrap-style:none;mso-wrap-distance-left:0;mso-wrap-distance-top:0;mso-wrap-distance-right:0;mso-wrap-distance-bottom:0;mso-position-horizontal:right;mso-position-horizontal-relative:page;mso-position-vertical:top;mso-position-vertical-relative:page;v-text-anchor:top" o:gfxdata="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" filled="f" stroked="f">
+            <v:shape id="Caixa de Texto 2" o:spid="_x0000_s1026" type="#_x0000_t202" alt="Uso Interno" style="position:absolute;margin-left:19.05pt;margin-top:0;width:70.25pt;height:27.2pt;z-index:251658241;visibility:visible;mso-wrap-style:none;mso-wrap-distance-left:0;mso-wrap-distance-top:0;mso-wrap-distance-right:0;mso-wrap-distance-bottom:0;mso-position-horizontal:right;mso-position-horizontal-relative:page;mso-position-vertical:top;mso-position-vertical-relative:page;v-text-anchor:top" o:gfxdata="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" filled="f" stroked="f">
               <v:textbox style="mso-fit-shape-to-text:t" inset="0,15pt,20pt,0">
                 <w:txbxContent>
                   <w:p>
@@ -5837,7 +5832,7 @@
       <mc:AlternateContent>
         <mc:Choice Requires="wps">
           <w:drawing>
-            <wp:anchor distT="0" distB="0" distL="0" distR="0" simplePos="0" relativeHeight="251660288" behindDoc="0" locked="0" layoutInCell="1" allowOverlap="1" wp14:anchorId="58ED75DE" wp14:editId="557F10B0">
+            <wp:anchor distT="0" distB="0" distL="0" distR="0" simplePos="0" relativeHeight="251658242" behindDoc="0" locked="0" layoutInCell="1" allowOverlap="1" wp14:anchorId="58ED75DE" wp14:editId="557F10B0">
               <wp:simplePos x="1079500" y="450850"/>
               <wp:positionH relativeFrom="page">
                 <wp:align>right</wp:align>
@@ -5916,7 +5911,7 @@
               <v:stroke joinstyle="miter"/>
               <v:path gradientshapeok="t" o:connecttype="rect"/>
             </v:shapetype>
-            <v:shape id="Caixa de Texto 3" o:spid="_x0000_s1027" type="#_x0000_t202" alt="Uso Interno" style="position:absolute;margin-left:19.05pt;margin-top:0;width:70.25pt;height:27.2pt;z-index:251660288;visibility:visible;mso-wrap-style:none;mso-wrap-distance-left:0;mso-wrap-distance-top:0;mso-wrap-distance-right:0;mso-wrap-distance-bottom:0;mso-position-horizontal:right;mso-position-horizontal-relative:page;mso-position-vertical:top;mso-position-vertical-relative:page;v-text-anchor:top" o:gfxdata="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" filled="f" stroked="f">
+            <v:shape id="Caixa de Texto 3" o:spid="_x0000_s1027" type="#_x0000_t202" alt="Uso Interno" style="position:absolute;margin-left:19.05pt;margin-top:0;width:70.25pt;height:27.2pt;z-index:251658242;visibility:visible;mso-wrap-style:none;mso-wrap-distance-left:0;mso-wrap-distance-top:0;mso-wrap-distance-right:0;mso-wrap-distance-bottom:0;mso-position-horizontal:right;mso-position-horizontal-relative:page;mso-position-vertical:top;mso-position-vertical-relative:page;v-text-anchor:top" o:gfxdata="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" filled="f" stroked="f">
               <v:textbox style="mso-fit-shape-to-text:t" inset="0,15pt,20pt,0">
                 <w:txbxContent>
                   <w:p>
@@ -5999,7 +5994,7 @@
 <w:hdr xmlns:wpc="http://schemas.microsoft.com/office/word/2010/wordprocessingCanvas" xmlns:cx="http://schemas.microsoft.com/office/drawing/2014/chartex" xmlns:cx1="http://schemas.microsoft.com/office/drawing/2015/9/8/chartex" xmlns:cx2="http://schemas.microsoft.com/office/drawing/2015/10/21/chartex" xmlns:cx3="http://schemas.microsoft.com/office/drawing/2016/5/9/chartex" xmlns:cx4="http://schemas.microsoft.com/office/drawing/2016/5/10/chartex" xmlns:cx5="http://schemas.microsoft.com/office/drawing/2016/5/11/chartex" xmlns:cx6="http://schemas.microsoft.com/office/drawing/2016/5/12/chartex" xmlns:cx7="http://schemas.microsoft.com/office/drawing/2016/5/13/chartex" xmlns:cx8="http://schemas.microsoft.com/office/drawing/2016/5/14/chartex" xmlns:mc="http://schemas.openxmlformats.org/markup-compatibility/2006" xmlns:aink="http://schemas.microsoft.com/office/drawing/2016/ink" xmlns:am3d="http://schemas.microsoft.com/office/drawing/2017/model3d" xmlns:o="urn:schemas-microsoft-com:office:office" xmlns:oel="http://schemas.microsoft.com/office/2019/extlst" xmlns:r="http://schemas.openxmlformats.org/officeDocument/2006/relationships" xmlns:m="http://schemas.openxmlformats.org/officeDocument/2006/math" xmlns:v="urn:schemas-microsoft-com:vml" xmlns:wp14="http://schemas.microsoft.com/office/word/2010/wordprocessingDrawing" xmlns:wp="http://schemas.openxmlformats.org/drawingml/2006/wordprocessingDrawing" xmlns:w10="urn:schemas-microsoft-com:office:word" xmlns:w="http://schemas.openxmlformats.org/wordprocessingml/2006/main" xmlns:w14="http://schemas.microsoft.com/office/word/2010/wordml" xmlns:w15="http://schemas.microsoft.com/office/word/2012/wordml" xmlns:w16cex="http://schemas.microsoft.com/office/word/2018/wordml/cex" xmlns:w16cid="http://schemas.microsoft.com/office/word/2016/wordml/cid" xmlns:w16="http://schemas.microsoft.com/office/word/2018/wordml" xmlns:w16du="http://schemas.microsoft.com/office/word/2023/wordml/word16du" xmlns:w16sdtdh="http://schemas.microsoft.com/office/word/2020/wordml/sdtdatahash" xmlns:w16sdtfl="http://schemas.microsoft.com/office/word/2024/wordml/sdtformatlock" xmlns:w16se="http://schemas.microsoft.com/office/word/2015/wordml/symex" xmlns:wpg="http://schemas.microsoft.com/office/word/2010/wordprocessingGroup" xmlns:wpi="http://schemas.microsoft.com/office/word/2010/wordprocessingInk" xmlns:wne="http://schemas.microsoft.com/office/word/2006/wordml" xmlns:wps="http://schemas.microsoft.com/office/word/2010/wordprocessingShape" mc:Ignorable="w14 w15 w16se w16cid w16 w16cex w16sdtdh w16sdtfl w16du wp14">
   <w:p>
     <w:pPr>
-      <w:pStyle w:val="Cabealho"/>
+      <w:pStyle w:val="Header"/>
     </w:pPr>
     <w:r>
       <w:rPr>
@@ -6743,7 +6738,7 @@
     <w:name w:val="Normal"/>
     <w:qFormat/>
   </w:style>
-  <w:style w:type="paragraph" w:styleId="Ttulo1">
+  <w:style w:type="paragraph" w:styleId="Heading1">
     <w:name w:val="heading 1"/>
     <w:uiPriority w:val="9"/>
     <w:qFormat/>
@@ -6759,7 +6754,7 @@
       <w:szCs w:val="28"/>
     </w:rPr>
   </w:style>
-  <w:style w:type="paragraph" w:styleId="Ttulo2">
+  <w:style w:type="paragraph" w:styleId="Heading2">
     <w:name w:val="heading 2"/>
     <w:uiPriority w:val="9"/>
     <w:unhideWhenUsed/>
@@ -6776,7 +6771,7 @@
       <w:szCs w:val="23"/>
     </w:rPr>
   </w:style>
-  <w:style w:type="paragraph" w:styleId="Ttulo3">
+  <w:style w:type="paragraph" w:styleId="Heading3">
     <w:name w:val="heading 3"/>
     <w:uiPriority w:val="9"/>
     <w:semiHidden/>
@@ -6791,7 +6786,7 @@
       <w:szCs w:val="24"/>
     </w:rPr>
   </w:style>
-  <w:style w:type="paragraph" w:styleId="Ttulo4">
+  <w:style w:type="paragraph" w:styleId="Heading4">
     <w:name w:val="heading 4"/>
     <w:uiPriority w:val="9"/>
     <w:semiHidden/>
@@ -6806,7 +6801,7 @@
       <w:color w:val="2E74B5"/>
     </w:rPr>
   </w:style>
-  <w:style w:type="paragraph" w:styleId="Ttulo5">
+  <w:style w:type="paragraph" w:styleId="Heading5">
     <w:name w:val="heading 5"/>
     <w:uiPriority w:val="9"/>
     <w:semiHidden/>
@@ -6819,7 +6814,7 @@
       <w:color w:val="2E74B5"/>
     </w:rPr>
   </w:style>
-  <w:style w:type="paragraph" w:styleId="Ttulo6">
+  <w:style w:type="paragraph" w:styleId="Heading6">
     <w:name w:val="heading 6"/>
     <w:uiPriority w:val="9"/>
     <w:semiHidden/>
@@ -6832,12 +6827,13 @@
       <w:color w:val="1F4D78"/>
     </w:rPr>
   </w:style>
-  <w:style w:type="character" w:default="1" w:styleId="Fontepargpadro">
+  <w:style w:type="character" w:default="1" w:styleId="DefaultParagraphFont">
     <w:name w:val="Default Paragraph Font"/>
     <w:uiPriority w:val="1"/>
+    <w:semiHidden/>
     <w:unhideWhenUsed/>
   </w:style>
-  <w:style w:type="table" w:default="1" w:styleId="Tabelanormal">
+  <w:style w:type="table" w:default="1" w:styleId="TableNormal">
     <w:name w:val="Normal Table"/>
     <w:uiPriority w:val="99"/>
     <w:semiHidden/>
@@ -6852,13 +6848,13 @@
       </w:tblCellMar>
     </w:tblPr>
   </w:style>
-  <w:style w:type="numbering" w:default="1" w:styleId="Semlista">
+  <w:style w:type="numbering" w:default="1" w:styleId="NoList">
     <w:name w:val="No List"/>
     <w:uiPriority w:val="99"/>
     <w:semiHidden/>
     <w:unhideWhenUsed/>
   </w:style>
-  <w:style w:type="paragraph" w:styleId="Ttulo">
+  <w:style w:type="paragraph" w:styleId="Title">
     <w:name w:val="Title"/>
     <w:uiPriority w:val="10"/>
     <w:qFormat/>
@@ -6875,7 +6871,7 @@
       <w:bCs/>
     </w:rPr>
   </w:style>
-  <w:style w:type="paragraph" w:styleId="PargrafodaLista">
+  <w:style w:type="paragraph" w:styleId="ListParagraph">
     <w:name w:val="List Paragraph"/>
     <w:uiPriority w:val="34"/>
     <w:qFormat/>
@@ -6889,7 +6885,7 @@
       <w:u w:val="single"/>
     </w:rPr>
   </w:style>
-  <w:style w:type="character" w:styleId="Refdenotaderodap">
+  <w:style w:type="character" w:styleId="FootnoteReference">
     <w:name w:val="footnote reference"/>
     <w:uiPriority w:val="99"/>
     <w:semiHidden/>
@@ -6898,9 +6894,9 @@
       <w:vertAlign w:val="superscript"/>
     </w:rPr>
   </w:style>
-  <w:style w:type="paragraph" w:styleId="Textodenotaderodap">
+  <w:style w:type="paragraph" w:styleId="FootnoteText">
     <w:name w:val="footnote text"/>
-    <w:link w:val="TextodenotaderodapChar"/>
+    <w:link w:val="FootnoteTextChar"/>
     <w:uiPriority w:val="99"/>
     <w:semiHidden/>
     <w:unhideWhenUsed/>
@@ -6909,9 +6905,9 @@
       <w:szCs w:val="20"/>
     </w:rPr>
   </w:style>
-  <w:style w:type="character" w:customStyle="1" w:styleId="TextodenotaderodapChar">
-    <w:name w:val="Texto de nota de rodapé Char"/>
-    <w:link w:val="Textodenotaderodap"/>
+  <w:style w:type="character" w:customStyle="1" w:styleId="FootnoteTextChar">
+    <w:name w:val="Footnote Text Char"/>
+    <w:link w:val="FootnoteText"/>
     <w:uiPriority w:val="99"/>
     <w:semiHidden/>
     <w:unhideWhenUsed/>
@@ -6920,7 +6916,7 @@
       <w:szCs w:val="20"/>
     </w:rPr>
   </w:style>
-  <w:style w:type="character" w:styleId="Refdenotadefim">
+  <w:style w:type="character" w:styleId="EndnoteReference">
     <w:name w:val="endnote reference"/>
     <w:uiPriority w:val="99"/>
     <w:semiHidden/>
@@ -6929,9 +6925,9 @@
       <w:vertAlign w:val="superscript"/>
     </w:rPr>
   </w:style>
-  <w:style w:type="paragraph" w:styleId="Textodenotadefim">
+  <w:style w:type="paragraph" w:styleId="EndnoteText">
     <w:name w:val="endnote text"/>
-    <w:link w:val="TextodenotadefimChar"/>
+    <w:link w:val="EndnoteTextChar"/>
     <w:uiPriority w:val="99"/>
     <w:semiHidden/>
     <w:unhideWhenUsed/>
@@ -6940,9 +6936,9 @@
       <w:szCs w:val="20"/>
     </w:rPr>
   </w:style>
-  <w:style w:type="character" w:customStyle="1" w:styleId="TextodenotadefimChar">
-    <w:name w:val="Texto de nota de fim Char"/>
-    <w:link w:val="Textodenotadefim"/>
+  <w:style w:type="character" w:customStyle="1" w:styleId="EndnoteTextChar">
+    <w:name w:val="Endnote Text Char"/>
+    <w:link w:val="EndnoteText"/>
     <w:uiPriority w:val="99"/>
     <w:semiHidden/>
     <w:unhideWhenUsed/>
@@ -6951,7 +6947,7 @@
       <w:szCs w:val="20"/>
     </w:rPr>
   </w:style>
-  <w:style w:type="paragraph" w:styleId="Sumrio1">
+  <w:style w:type="paragraph" w:styleId="TOC1">
     <w:name w:val="toc 1"/>
     <w:basedOn w:val="Normal"/>
     <w:next w:val="Normal"/>
@@ -6963,10 +6959,10 @@
       <w:spacing w:after="100"/>
     </w:pPr>
   </w:style>
-  <w:style w:type="paragraph" w:styleId="Cabealho">
+  <w:style w:type="paragraph" w:styleId="Header">
     <w:name w:val="header"/>
     <w:basedOn w:val="Normal"/>
-    <w:link w:val="CabealhoChar"/>
+    <w:link w:val="HeaderChar"/>
     <w:uiPriority w:val="99"/>
     <w:unhideWhenUsed/>
     <w:rsid w:val="00D4622E"/>
@@ -6977,17 +6973,17 @@
       </w:tabs>
     </w:pPr>
   </w:style>
-  <w:style w:type="character" w:customStyle="1" w:styleId="CabealhoChar">
-    <w:name w:val="Cabeçalho Char"/>
-    <w:basedOn w:val="Fontepargpadro"/>
-    <w:link w:val="Cabealho"/>
+  <w:style w:type="character" w:customStyle="1" w:styleId="HeaderChar">
+    <w:name w:val="Header Char"/>
+    <w:basedOn w:val="DefaultParagraphFont"/>
+    <w:link w:val="Header"/>
     <w:uiPriority w:val="99"/>
     <w:rsid w:val="00D4622E"/>
   </w:style>
-  <w:style w:type="paragraph" w:styleId="Rodap">
+  <w:style w:type="paragraph" w:styleId="Footer">
     <w:name w:val="footer"/>
     <w:basedOn w:val="Normal"/>
-    <w:link w:val="RodapChar"/>
+    <w:link w:val="FooterChar"/>
     <w:uiPriority w:val="99"/>
     <w:unhideWhenUsed/>
     <w:rsid w:val="00D4622E"/>
@@ -6998,10 +6994,10 @@
       </w:tabs>
     </w:pPr>
   </w:style>
-  <w:style w:type="character" w:customStyle="1" w:styleId="RodapChar">
-    <w:name w:val="Rodapé Char"/>
-    <w:basedOn w:val="Fontepargpadro"/>
-    <w:link w:val="Rodap"/>
+  <w:style w:type="character" w:customStyle="1" w:styleId="FooterChar">
+    <w:name w:val="Footer Char"/>
+    <w:basedOn w:val="DefaultParagraphFont"/>
+    <w:link w:val="Footer"/>
     <w:uiPriority w:val="99"/>
     <w:rsid w:val="00D4622E"/>
   </w:style>
@@ -7326,5 +7322,6 @@
 <file path=docMetadata/LabelInfo.xml><?xml version="1.0" encoding="utf-8"?>
 <clbl:labelList xmlns:clbl="http://schemas.microsoft.com/office/2020/mipLabelMetadata">
   <clbl:label id="{4feff2ac-c3de-488c-99b2-c6384bfed2ea}" enabled="1" method="Standard" siteId="{9744600e-3e04-492e-baa1-25ec245c6f10}" removed="0"/>
+  <clbl:label id="{bb5d96ea-ab39-44a0-a6d6-b6f0aac5958b}" enabled="1" method="Privileged" siteId="{76a2ae5a-9f00-4f6b-95ed-5d33d77c4d61}" removed="0"/>
 </clbl:labelList>
 </file>
</xml_diff>